<commit_message>
audit 24 caught three literals I typed into the new section
The spallation section wrote "14.1 MeV" and the three scanned spallation
yields as bare numerals. That is exactly the class of fault audit 24 exists to
catch: the source is supposed to carry no numerals at all, and every quantity
is supposed to be bound to a named ledger row by id.

The neutron energy is now cited as C58. The three yields become ledger rows
with status ASSUMED, which renders them "100 per proton [ASSUMED]" -- correct,
because they are inputs a reader supplies to the break-even and not figures
this paper derives.

Also a logical slip found by reading the render: the text said the pion yield
and the collection fix "the left-hand side" of f < w.Y_fus/Y, when what they
fix is the numerator on the right. Corrected.

audit 24 verified PASS directly; the full sweep is still running.

Co-Authored-By: Claude Opus 5 <noreply@anthropic.com>
Claude-Session: https://claude.ai/code/session_01L65Vc1Khq4pbett1bFacxK
</commit_message>
<xml_diff>
--- a/papers/out/Cold_Fusion_v1.0.docx
+++ b/papers/out/Cold_Fusion_v1.0.docx
@@ -8918,7 +8918,7 @@
           <w:b w:val="0"/>
           <w:i w:val="0"/>
         </w:rPr>
-        <w:t xml:space="preserve">and the left-hand side is what §4.1's pion yield, §5.3's collection and the measured cycle count already fix: </w:t>
+        <w:t xml:space="preserve">and the numerator on the right is what §4.1's pion yield, §5.3's collection and the measured cycle count already fix: </w:t>
       </w:r>
       <w:r>
         <w:rPr>
@@ -8989,7 +8989,7 @@
                 <w:b w:val="0"/>
                 <w:i w:val="0"/>
               </w:rPr>
-              <w:t>100 neutrons per proton</w:t>
+              <w:t>100 per proton [ASSUMED]</w:t>
             </w:r>
           </w:p>
         </w:tc>
@@ -9021,7 +9021,7 @@
                 <w:b w:val="0"/>
                 <w:i w:val="0"/>
               </w:rPr>
-              <w:t>150 neutrons per proton</w:t>
+              <w:t>150 per proton [ASSUMED]</w:t>
             </w:r>
           </w:p>
         </w:tc>
@@ -9053,7 +9053,7 @@
                 <w:b w:val="0"/>
                 <w:i w:val="0"/>
               </w:rPr>
-              <w:t>250 neutrons per proton</w:t>
+              <w:t>250 per proton [ASSUMED]</w:t>
             </w:r>
           </w:p>
         </w:tc>
@@ -9108,7 +9108,7 @@
           <w:b w:val="0"/>
           <w:i w:val="0"/>
         </w:rPr>
-        <w:t xml:space="preserve"> It counts a 14.1 MeV neutron as worth exactly one spallation neutron, where in a fast blanket it is worth more, because 14.1 MeV drives fast fission in fertile material and (n,2n) that a spallation spectrum reaches less of. It does not count the alpha, which the muon route returns as heat directly. And it treats the transparency penalty as a straightforward loss, which in a </w:t>
+        <w:t xml:space="preserve"> It counts a 14.1 MeV neutron as worth exactly one spallation neutron, where in a fast blanket it is worth more, because that energy drives fast fission in fertile material, and (n,2n), that a spallation spectrum reaches less of. It does not count the alpha, which the muon route returns as heat directly. And it treats the transparency penalty as a straightforward loss, which in a </w:t>
       </w:r>
       <w:r>
         <w:rPr>

</xml_diff>